<commit_message>
fix: format label nama/nim/jurusan normal dan rapatkan hasil input dekat titik dua
</commit_message>
<xml_diff>
--- a/template_bimbingan.docx
+++ b/template_bimbingan.docx
@@ -31,9 +31,9 @@
         </w:tblBorders>
       </w:tblPr>
       <w:tblGrid>
-        <w:gridCol w:w="3213"/>
-        <w:gridCol w:w="3213"/>
-        <w:gridCol w:w="3213"/>
+        <w:gridCol w:w="2300"/>
+        <w:gridCol w:w="250"/>
+        <w:gridCol w:w="6900"/>
       </w:tblGrid>
       <w:tr>
         <w:trPr>
@@ -41,7 +41,7 @@
         </w:trPr>
         <w:tc>
           <w:tcPr>
-            <w:tcW w:type="dxa" w:w="1984"/>
+            <w:tcW w:type="dxa" w:w="2300"/>
             <w:tcMar>
               <w:top w:w="20" w:type="dxa"/>
               <w:bottom w:w="20" w:type="dxa"/>
@@ -65,7 +65,7 @@
         </w:tc>
         <w:tc>
           <w:tcPr>
-            <w:tcW w:type="dxa" w:w="283"/>
+            <w:tcW w:type="dxa" w:w="250"/>
             <w:tcMar>
               <w:top w:w="20" w:type="dxa"/>
               <w:bottom w:w="20" w:type="dxa"/>
@@ -88,11 +88,11 @@
         </w:tc>
         <w:tc>
           <w:tcPr>
-            <w:tcW w:type="dxa" w:w="7370"/>
+            <w:tcW w:type="dxa" w:w="6900"/>
             <w:tcMar>
               <w:top w:w="20" w:type="dxa"/>
               <w:bottom w:w="20" w:type="dxa"/>
-              <w:left w:w="0" w:type="dxa"/>
+              <w:left w:w="100" w:type="dxa"/>
               <w:right w:w="0" w:type="dxa"/>
             </w:tcMar>
           </w:tcPr>
@@ -116,7 +116,7 @@
         </w:trPr>
         <w:tc>
           <w:tcPr>
-            <w:tcW w:type="dxa" w:w="1984"/>
+            <w:tcW w:type="dxa" w:w="2300"/>
             <w:tcMar>
               <w:top w:w="20" w:type="dxa"/>
               <w:bottom w:w="20" w:type="dxa"/>
@@ -140,7 +140,7 @@
         </w:tc>
         <w:tc>
           <w:tcPr>
-            <w:tcW w:type="dxa" w:w="283"/>
+            <w:tcW w:type="dxa" w:w="250"/>
             <w:tcMar>
               <w:top w:w="20" w:type="dxa"/>
               <w:bottom w:w="20" w:type="dxa"/>
@@ -163,11 +163,11 @@
         </w:tc>
         <w:tc>
           <w:tcPr>
-            <w:tcW w:type="dxa" w:w="7370"/>
+            <w:tcW w:type="dxa" w:w="6900"/>
             <w:tcMar>
               <w:top w:w="20" w:type="dxa"/>
               <w:bottom w:w="20" w:type="dxa"/>
-              <w:left w:w="0" w:type="dxa"/>
+              <w:left w:w="100" w:type="dxa"/>
               <w:right w:w="0" w:type="dxa"/>
             </w:tcMar>
           </w:tcPr>
@@ -191,7 +191,7 @@
         </w:trPr>
         <w:tc>
           <w:tcPr>
-            <w:tcW w:type="dxa" w:w="1984"/>
+            <w:tcW w:type="dxa" w:w="2300"/>
             <w:tcMar>
               <w:top w:w="20" w:type="dxa"/>
               <w:bottom w:w="20" w:type="dxa"/>
@@ -215,7 +215,7 @@
         </w:tc>
         <w:tc>
           <w:tcPr>
-            <w:tcW w:type="dxa" w:w="283"/>
+            <w:tcW w:type="dxa" w:w="250"/>
             <w:tcMar>
               <w:top w:w="20" w:type="dxa"/>
               <w:bottom w:w="20" w:type="dxa"/>
@@ -238,11 +238,11 @@
         </w:tc>
         <w:tc>
           <w:tcPr>
-            <w:tcW w:type="dxa" w:w="7370"/>
+            <w:tcW w:type="dxa" w:w="6900"/>
             <w:tcMar>
               <w:top w:w="20" w:type="dxa"/>
               <w:bottom w:w="20" w:type="dxa"/>
-              <w:left w:w="0" w:type="dxa"/>
+              <w:left w:w="100" w:type="dxa"/>
               <w:right w:w="0" w:type="dxa"/>
             </w:tcMar>
           </w:tcPr>
@@ -266,7 +266,7 @@
         </w:trPr>
         <w:tc>
           <w:tcPr>
-            <w:tcW w:type="dxa" w:w="1984"/>
+            <w:tcW w:type="dxa" w:w="2300"/>
             <w:tcMar>
               <w:top w:w="20" w:type="dxa"/>
               <w:bottom w:w="20" w:type="dxa"/>
@@ -290,7 +290,7 @@
         </w:tc>
         <w:tc>
           <w:tcPr>
-            <w:tcW w:type="dxa" w:w="283"/>
+            <w:tcW w:type="dxa" w:w="250"/>
             <w:tcMar>
               <w:top w:w="20" w:type="dxa"/>
               <w:bottom w:w="20" w:type="dxa"/>
@@ -313,11 +313,11 @@
         </w:tc>
         <w:tc>
           <w:tcPr>
-            <w:tcW w:type="dxa" w:w="7370"/>
+            <w:tcW w:type="dxa" w:w="6900"/>
             <w:tcMar>
               <w:top w:w="20" w:type="dxa"/>
               <w:bottom w:w="20" w:type="dxa"/>
-              <w:left w:w="0" w:type="dxa"/>
+              <w:left w:w="100" w:type="dxa"/>
               <w:right w:w="0" w:type="dxa"/>
             </w:tcMar>
           </w:tcPr>

</xml_diff>